<commit_message>
feat: propagate managerial-moderator citations; align MAIDA/OSF with manuscript
- P7 (apjm + jibs packages): propagated Phan et al. (2020) self-citation + Nielsen (2010) into 2.5
  (matching the ibr package); docx rebuilt.
- Dissertation: added Phan, Do & Phan (2020) to the H4 upper-echelons discussion (chuong_2 2.5.5) and
  both Nielsen (2010) + Phan, Do & Phan (2020) to 04_references_apa7 (distinct from the existing
  Phan, Tran & Lu 2020 entry).
- MAIDA extractor.py: corrected the legacy cdai_score label ('Cultural Distance Asymmetry Index', 0–10)
  to 'country Digital Adoption Index (World Bank DAI / ITU DDI), 0–1' to match the manuscript construct.
- OSF pre-registration template: added an alignment note flagging DPL naming/phase and ICRV group-count
  mismatches to reconcile with the final manuscript before registering, plus DOI/date insertion.
</commit_message>
<xml_diff>
--- a/p7/submission/apjm_package/01_manuscript_blinded.docx
+++ b/p7/submission/apjm_package/01_manuscript_blinded.docx
@@ -2,7 +2,7 @@
 <file path=word/document.xml><?xml version="1.0" encoding="utf-8"?>
 <w:document xmlns:w="http://schemas.openxmlformats.org/wordprocessingml/2006/main" xmlns:m="http://schemas.openxmlformats.org/officeDocument/2006/math" xmlns:r="http://schemas.openxmlformats.org/officeDocument/2006/relationships" xmlns:o="urn:schemas-microsoft-com:office:office" xmlns:v="urn:schemas-microsoft-com:vml" xmlns:w10="urn:schemas-microsoft-com:office:word" xmlns:a="http://schemas.openxmlformats.org/drawingml/2006/main" xmlns:pic="http://schemas.openxmlformats.org/drawingml/2006/picture" xmlns:wp="http://schemas.openxmlformats.org/drawingml/2006/wordprocessingDrawing">
   <w:body>
-    <w:bookmarkStart w:id="78" w:name="Xf24ec467481d62a742d363f12c684976d74bdf7"/>
+    <w:bookmarkStart w:id="80" w:name="Xf24ec467481d62a742d363f12c684976d74bdf7"/>
     <w:p>
       <w:pPr>
         <w:pStyle w:val="Heading1"/>
@@ -1141,7 +1141,31 @@
         <w:t xml:space="preserve"> </w:t>
       </w:r>
       <w:r>
-        <w:t xml:space="preserve">al., 2019). We expect both to raise the performance level for any given</w:t>
+        <w:t xml:space="preserve">al., 2019). Firm-level evidence on manufacturing exporters shows that</w:t>
+      </w:r>
+      <w:r>
+        <w:t xml:space="preserve"> </w:t>
+      </w:r>
+      <w:r>
+        <w:t xml:space="preserve">manager experience and gender can moderate the</w:t>
+      </w:r>
+      <w:r>
+        <w:t xml:space="preserve"> </w:t>
+      </w:r>
+      <w:r>
+        <w:t xml:space="preserve">internationalization–performance relationship (Phan et al., 2020), and</w:t>
+      </w:r>
+      <w:r>
+        <w:t xml:space="preserve"> </w:t>
+      </w:r>
+      <w:r>
+        <w:t xml:space="preserve">top-management-team internationalization shapes performance through</w:t>
+      </w:r>
+      <w:r>
+        <w:t xml:space="preserve"> </w:t>
+      </w:r>
+      <w:r>
+        <w:t xml:space="preserve">foreign-market entry (Nielsen, 2010). We expect both to raise the performance level for any given</w:t>
       </w:r>
       <w:r>
         <w:t xml:space="preserve"> </w:t>
@@ -4132,7 +4156,7 @@
       </w:r>
     </w:p>
     <w:bookmarkEnd w:id="50"/>
-    <w:bookmarkStart w:id="75" w:name="references"/>
+    <w:bookmarkStart w:id="77" w:name="references"/>
     <w:p>
       <w:pPr>
         <w:pStyle w:val="Heading2"/>
@@ -5351,6 +5375,58 @@
         <w:pStyle w:val="BodyText"/>
       </w:pPr>
       <w:r>
+        <w:t xml:space="preserve">Nielsen, S. (2010). Top management team internationalization and firm</w:t>
+      </w:r>
+      <w:r>
+        <w:t xml:space="preserve"> </w:t>
+      </w:r>
+      <w:r>
+        <w:t xml:space="preserve">performance: The mediating role of foreign market entry.</w:t>
+      </w:r>
+      <w:r>
+        <w:t xml:space="preserve"> </w:t>
+      </w:r>
+      <w:r>
+        <w:rPr>
+          <w:iCs/>
+          <w:i/>
+        </w:rPr>
+        <w:t xml:space="preserve">Management</w:t>
+      </w:r>
+      <w:r>
+        <w:rPr>
+          <w:iCs/>
+          <w:i/>
+        </w:rPr>
+        <w:t xml:space="preserve"> </w:t>
+      </w:r>
+      <w:r>
+        <w:rPr>
+          <w:iCs/>
+          <w:i/>
+        </w:rPr>
+        <w:t xml:space="preserve">International Review, 50</w:t>
+      </w:r>
+      <w:r>
+        <w:t xml:space="preserve">(2), 185–206.</w:t>
+      </w:r>
+      <w:r>
+        <w:t xml:space="preserve"> </w:t>
+      </w:r>
+      <w:hyperlink r:id="rId70">
+        <w:r>
+          <w:rPr>
+            <w:rStyle w:val="Hyperlink"/>
+          </w:rPr>
+          <w:t xml:space="preserve">https://doi.org/10.1007/s11575-010-0029-0</w:t>
+        </w:r>
+      </w:hyperlink>
+    </w:p>
+    <w:p>
+      <w:pPr>
+        <w:pStyle w:val="BodyText"/>
+      </w:pPr>
+      <w:r>
         <w:t xml:space="preserve">North, D. C. (1990).</w:t>
       </w:r>
       <w:r>
@@ -5410,7 +5486,7 @@
       <w:r>
         <w:t xml:space="preserve"> </w:t>
       </w:r>
-      <w:hyperlink r:id="rId70">
+      <w:hyperlink r:id="rId71">
         <w:r>
           <w:rPr>
             <w:rStyle w:val="Hyperlink"/>
@@ -5424,6 +5500,56 @@
         <w:pStyle w:val="BodyText"/>
       </w:pPr>
       <w:r>
+        <w:t xml:space="preserve">Phan, A. T., Do, T. H., &amp; Phan, M. T. (2020). The moderating effects of</w:t>
+      </w:r>
+      <w:r>
+        <w:t xml:space="preserve"> </w:t>
+      </w:r>
+      <w:r>
+        <w:t xml:space="preserve">managers' experience and gender on internationalization and firm</w:t>
+      </w:r>
+      <w:r>
+        <w:t xml:space="preserve"> </w:t>
+      </w:r>
+      <w:r>
+        <w:t xml:space="preserve">performance of manufacturing enterprises in Turkey.</w:t>
+      </w:r>
+      <w:r>
+        <w:t xml:space="preserve"> </w:t>
+      </w:r>
+      <w:r>
+        <w:rPr>
+          <w:iCs/>
+          <w:i/>
+        </w:rPr>
+        <w:t xml:space="preserve">Accounting, 6</w:t>
+      </w:r>
+      <w:r>
+        <w:t xml:space="preserve">(7),</w:t>
+      </w:r>
+      <w:r>
+        <w:t xml:space="preserve"> </w:t>
+      </w:r>
+      <w:r>
+        <w:t xml:space="preserve">1209–1216.</w:t>
+      </w:r>
+      <w:r>
+        <w:t xml:space="preserve"> </w:t>
+      </w:r>
+      <w:hyperlink r:id="rId72">
+        <w:r>
+          <w:rPr>
+            <w:rStyle w:val="Hyperlink"/>
+          </w:rPr>
+          <w:t xml:space="preserve">https://doi.org/10.5267/j.ac.2020.9.006</w:t>
+        </w:r>
+      </w:hyperlink>
+    </w:p>
+    <w:p>
+      <w:pPr>
+        <w:pStyle w:val="BodyText"/>
+      </w:pPr>
+      <w:r>
         <w:t xml:space="preserve">Richard, O. C., Kirby, S. L., &amp; Chadwick, K. (2019). The impact of</w:t>
       </w:r>
       <w:r>
@@ -5588,7 +5714,7 @@
       <w:r>
         <w:t xml:space="preserve"> </w:t>
       </w:r>
-      <w:hyperlink r:id="rId71">
+      <w:hyperlink r:id="rId73">
         <w:r>
           <w:rPr>
             <w:rStyle w:val="Hyperlink"/>
@@ -5634,7 +5760,7 @@
       <w:r>
         <w:t xml:space="preserve"> </w:t>
       </w:r>
-      <w:hyperlink r:id="rId72">
+      <w:hyperlink r:id="rId74">
         <w:r>
           <w:rPr>
             <w:rStyle w:val="Hyperlink"/>
@@ -5666,7 +5792,7 @@
       <w:r>
         <w:t xml:space="preserve"> </w:t>
       </w:r>
-      <w:hyperlink r:id="rId73">
+      <w:hyperlink r:id="rId75">
         <w:r>
           <w:rPr>
             <w:rStyle w:val="Hyperlink"/>
@@ -5788,7 +5914,7 @@
       <w:r>
         <w:t xml:space="preserve"> </w:t>
       </w:r>
-      <w:hyperlink r:id="rId74">
+      <w:hyperlink r:id="rId76">
         <w:r>
           <w:rPr>
             <w:rStyle w:val="Hyperlink"/>
@@ -5885,7 +6011,7 @@
       <w:r>
         <w:t xml:space="preserve"> </w:t>
       </w:r>
-      <w:hyperlink r:id="rId74">
+      <w:hyperlink r:id="rId76">
         <w:r>
           <w:rPr>
             <w:rStyle w:val="Hyperlink"/>
@@ -5927,8 +6053,8 @@
         <w:t xml:space="preserve">(4), 305–320.</w:t>
       </w:r>
     </w:p>
-    <w:bookmarkEnd w:id="75"/>
-    <w:bookmarkStart w:id="76" w:name="appendix-a-model-sequence"/>
+    <w:bookmarkEnd w:id="77"/>
+    <w:bookmarkStart w:id="78" w:name="appendix-a-model-sequence"/>
     <w:p>
       <w:pPr>
         <w:pStyle w:val="Heading2"/>
@@ -8812,8 +8938,8 @@
         <w:t xml:space="preserve">mgr_female=+0.187***, female_owner=+0.128**.</w:t>
       </w:r>
     </w:p>
-    <w:bookmarkEnd w:id="76"/>
-    <w:bookmarkStart w:id="77" w:name="X09b5d89c7c8f35bf9d25d1bfe47da72b2ba58bf"/>
+    <w:bookmarkEnd w:id="78"/>
+    <w:bookmarkStart w:id="79" w:name="X09b5d89c7c8f35bf9d25d1bfe47da72b2ba58bf"/>
     <w:p>
       <w:pPr>
         <w:pStyle w:val="Heading2"/>
@@ -8896,8 +9022,8 @@
         <w:t xml:space="preserve">to output-per-worker vs. total-factor productivity operationalisations.</w:t>
       </w:r>
     </w:p>
-    <w:bookmarkEnd w:id="77"/>
-    <w:bookmarkEnd w:id="78"/>
+    <w:bookmarkEnd w:id="79"/>
+    <w:bookmarkEnd w:id="80"/>
     <w:sectPr/>
   </w:body>
 </w:document>

</xml_diff>

<commit_message>
chore(P7): regenerate submission docx after Group V relabel (Emerging/SIDS)
Rebuild ibr/apjm/jibs 01_manuscript_blinded.docx and the JIBS p7_capstone_vi.docx
from the updated markdown so the docx submission artifacts match the corrected
'Emerging/SIDS' label. Verified docx no longer contain 'Frontier/SIDS'.
</commit_message>
<xml_diff>
--- a/p7/submission/apjm_package/01_manuscript_blinded.docx
+++ b/p7/submission/apjm_package/01_manuscript_blinded.docx
@@ -2,7 +2,7 @@
 <file path=word/document.xml><?xml version="1.0" encoding="utf-8"?>
 <w:document xmlns:w="http://schemas.openxmlformats.org/wordprocessingml/2006/main" xmlns:m="http://schemas.openxmlformats.org/officeDocument/2006/math" xmlns:r="http://schemas.openxmlformats.org/officeDocument/2006/relationships" xmlns:o="urn:schemas-microsoft-com:office:office" xmlns:v="urn:schemas-microsoft-com:vml" xmlns:w10="urn:schemas-microsoft-com:office:word" xmlns:a="http://schemas.openxmlformats.org/drawingml/2006/main" xmlns:pic="http://schemas.openxmlformats.org/drawingml/2006/picture" xmlns:wp="http://schemas.openxmlformats.org/drawingml/2006/wordprocessingDrawing">
   <w:body>
-    <w:bookmarkStart w:id="81" w:name="Xf24ec467481d62a742d363f12c684976d74bdf7"/>
+    <w:bookmarkStart w:id="78" w:name="Xf24ec467481d62a742d363f12c684976d74bdf7"/>
     <w:p>
       <w:pPr>
         <w:pStyle w:val="Heading1"/>
@@ -191,7 +191,7 @@
       </w:r>
     </w:p>
     <w:bookmarkEnd w:id="20"/>
-    <w:bookmarkStart w:id="21" w:name="Xe3d0fc0bea9a42ce7605565d0964033d7f6ee47"/>
+    <w:bookmarkStart w:id="21" w:name="introduction"/>
     <w:p>
       <w:pPr>
         <w:pStyle w:val="Heading2"/>
@@ -473,7 +473,7 @@
       </w:r>
     </w:p>
     <w:bookmarkEnd w:id="21"/>
-    <w:bookmarkStart w:id="29" w:name="Xce0b9068aa677089fdc23e66f61b75516af2bf7"/>
+    <w:bookmarkStart w:id="29" w:name="theoretical-framework-and-hypotheses"/>
     <w:p>
       <w:pPr>
         <w:pStyle w:val="Heading2"/>
@@ -482,7 +482,7 @@
         <w:t xml:space="preserve">2. Theoretical Framework and Hypotheses</w:t>
       </w:r>
     </w:p>
-    <w:bookmarkStart w:id="22" w:name="X61eb865d3ba9c18e1eda9971096f2566a95b0ec"/>
+    <w:bookmarkStart w:id="22" w:name="theoretical-foundations"/>
     <w:p>
       <w:pPr>
         <w:pStyle w:val="Heading3"/>
@@ -566,7 +566,7 @@
       </w:r>
     </w:p>
     <w:bookmarkEnd w:id="22"/>
-    <w:bookmarkStart w:id="23" w:name="Xf68c2510db72354551e5b442c06e6149a212286"/>
+    <w:bookmarkStart w:id="23" w:name="the-non-linear-ip-relationship-h1"/>
     <w:p>
       <w:pPr>
         <w:pStyle w:val="Heading3"/>
@@ -580,7 +580,7 @@
         <w:pStyle w:val="FirstParagraph"/>
       </w:pPr>
       <w:r>
-        <w:t xml:space="preserve">Contractor et al. (2003) formalised the three-stage S-curve hypothesis:</w:t>
+        <w:t xml:space="preserve">Contractor et al. (2003) formalised the three-stage S-curve hypothesis:</w:t>
       </w:r>
       <w:r>
         <w:t xml:space="preserve"> </w:t>
@@ -730,7 +730,7 @@
       </w:r>
     </w:p>
     <w:bookmarkEnd w:id="23"/>
-    <w:bookmarkStart w:id="24" w:name="X804c25e8bdbf8eade8cd93fdb8dbf851f3c8515"/>
+    <w:bookmarkStart w:id="24" w:name="Xe2f9215226203df0d35a74fbc3991b825156e23"/>
     <w:p>
       <w:pPr>
         <w:pStyle w:val="Heading3"/>
@@ -889,7 +889,7 @@
       </w:r>
     </w:p>
     <w:bookmarkEnd w:id="24"/>
-    <w:bookmarkStart w:id="25" w:name="Xf9645264d48ebb644ff7e280396113254c384c7"/>
+    <w:bookmarkStart w:id="25" w:name="digital-adoption-as-a-level-enhancer-h3"/>
     <w:p>
       <w:pPr>
         <w:pStyle w:val="Heading3"/>
@@ -927,7 +927,7 @@
         <w:t xml:space="preserve"> </w:t>
       </w:r>
       <w:r>
-        <w:t xml:space="preserve">dissertation, DAI's effect depends on the interaction of regime quality,</w:t>
+        <w:t xml:space="preserve">dissertation, DAI’s effect depends on the interaction of regime quality,</w:t>
       </w:r>
       <w:r>
         <w:t xml:space="preserve"> </w:t>
@@ -963,7 +963,7 @@
         <w:t xml:space="preserve"> </w:t>
       </w:r>
       <w:r>
-        <w:t xml:space="preserve">IV-estimated β(DAI) ≈ 0, consistent with selection bias in OLS), DAI's</w:t>
+        <w:t xml:space="preserve">IV-estimated β(DAI) ≈ 0, consistent with selection bias in OLS), DAI’s</w:t>
       </w:r>
       <w:r>
         <w:t xml:space="preserve"> </w:t>
@@ -1057,7 +1057,7 @@
       </w:r>
     </w:p>
     <w:bookmarkEnd w:id="25"/>
-    <w:bookmarkStart w:id="26" w:name="Xfde2382d547d6bd016a370b8abd9bb51c6ab875"/>
+    <w:bookmarkStart w:id="26" w:name="managerial-characteristics-h4"/>
     <w:p>
       <w:pPr>
         <w:pStyle w:val="Heading3"/>
@@ -1195,7 +1195,7 @@
       </w:r>
     </w:p>
     <w:bookmarkEnd w:id="26"/>
-    <w:bookmarkStart w:id="27" w:name="Xc04b0d08a7461e173e211ec4b938149d2f7c8bf"/>
+    <w:bookmarkStart w:id="27" w:name="X0b3fdaf9bb49b1730bc3a0521f76f654a8096ae"/>
     <w:p>
       <w:pPr>
         <w:pStyle w:val="Heading3"/>
@@ -1347,7 +1347,7 @@
       </w:r>
     </w:p>
     <w:bookmarkEnd w:id="27"/>
-    <w:bookmarkStart w:id="28" w:name="X0acb0ebe9609c9b4cd27b2f0dbe81194406b82a"/>
+    <w:bookmarkStart w:id="28" w:name="regime-contingent-digital-effects-h6"/>
     <w:p>
       <w:pPr>
         <w:pStyle w:val="Heading3"/>
@@ -1427,7 +1427,7 @@
         <w:t xml:space="preserve"> </w:t>
       </w:r>
       <w:r>
-        <w:t xml:space="preserve">capabilities' curve-reshaping potency (established in H3) varies</w:t>
+        <w:t xml:space="preserve">capabilities’ curve-reshaping potency (established in H3) varies</w:t>
       </w:r>
       <w:r>
         <w:t xml:space="preserve"> </w:t>
@@ -1563,7 +1563,7 @@
         <w:t xml:space="preserve"> </w:t>
       </w:r>
       <w:r>
-        <w:t xml:space="preserve">curve-reshaping effect: digital adoption's compressive effect on the</w:t>
+        <w:t xml:space="preserve">curve-reshaping effect: digital adoption’s compressive effect on the</w:t>
       </w:r>
       <w:r>
         <w:t xml:space="preserve"> </w:t>
@@ -1592,7 +1592,7 @@
     </w:p>
     <w:bookmarkEnd w:id="28"/>
     <w:bookmarkEnd w:id="29"/>
-    <w:bookmarkStart w:id="34" w:name="X5eb800a903106e48a684e9ea9de39ed619b9df8"/>
+    <w:bookmarkStart w:id="34" w:name="data-and-methods"/>
     <w:p>
       <w:pPr>
         <w:pStyle w:val="Heading2"/>
@@ -1601,7 +1601,7 @@
         <w:t xml:space="preserve">3. Data and Methods</w:t>
       </w:r>
     </w:p>
-    <w:bookmarkStart w:id="30" w:name="X180323993af082d7b264d69830cacecf330a102"/>
+    <w:bookmarkStart w:id="30" w:name="data-source"/>
     <w:p>
       <w:pPr>
         <w:pStyle w:val="Heading3"/>
@@ -1701,7 +1701,7 @@
         <w:t xml:space="preserve"> </w:t>
       </w:r>
       <w:r>
-        <w:t xml:space="preserve">applying outcome and FSTS non-missing requirements). Oman's available</w:t>
+        <w:t xml:space="preserve">applying outcome and FSTS non-missing requirements). Oman’s available</w:t>
       </w:r>
       <w:r>
         <w:t xml:space="preserve"> </w:t>
@@ -1765,7 +1765,7 @@
       </w:r>
     </w:p>
     <w:bookmarkEnd w:id="30"/>
-    <w:bookmarkStart w:id="31" w:name="Xbcf9f12e79107fa2c089aaf13fc6c4fb773f1c2"/>
+    <w:bookmarkStart w:id="31" w:name="variables"/>
     <w:p>
       <w:pPr>
         <w:pStyle w:val="Heading3"/>
@@ -2021,7 +2021,7 @@
       </w:r>
     </w:p>
     <w:bookmarkEnd w:id="31"/>
-    <w:bookmarkStart w:id="32" w:name="X88d3b635b18ee197bee6ec760e4576787847be1"/>
+    <w:bookmarkStart w:id="32" w:name="estimation-strategy"/>
     <w:p>
       <w:pPr>
         <w:pStyle w:val="Heading3"/>
@@ -2139,7 +2139,7 @@
       </w:r>
     </w:p>
     <w:bookmarkEnd w:id="32"/>
-    <w:bookmarkStart w:id="33" w:name="X7306ee6cc650c2a8c74023d786fd3b6ffa0ad4b"/>
+    <w:bookmarkStart w:id="33" w:name="sample-sizes"/>
     <w:p>
       <w:pPr>
         <w:pStyle w:val="Heading3"/>
@@ -2200,7 +2200,7 @@
     </w:p>
     <w:bookmarkEnd w:id="33"/>
     <w:bookmarkEnd w:id="34"/>
-    <w:bookmarkStart w:id="42" w:name="X121719332867ee227f0a04b486098cee978c6e6"/>
+    <w:bookmarkStart w:id="42" w:name="results"/>
     <w:p>
       <w:pPr>
         <w:pStyle w:val="Heading2"/>
@@ -2209,7 +2209,7 @@
         <w:t xml:space="preserve">4. Results</w:t>
       </w:r>
     </w:p>
-    <w:bookmarkStart w:id="35" w:name="X1a3b7383b8b125b3d271986dbdfbc78bb7f954a"/>
+    <w:bookmarkStart w:id="35" w:name="descriptive-statistics-and-correlations"/>
     <w:p>
       <w:pPr>
         <w:pStyle w:val="Heading3"/>
@@ -2275,7 +2275,7 @@
       </w:r>
     </w:p>
     <w:bookmarkEnd w:id="35"/>
-    <w:bookmarkStart w:id="36" w:name="Xdbf83b4a83d0a9c63e43fc4d25cefed1772f7cd"/>
+    <w:bookmarkStart w:id="36" w:name="main-effect-inverted-u-h1"/>
     <w:p>
       <w:pPr>
         <w:pStyle w:val="Heading3"/>
@@ -2455,7 +2455,7 @@
       </w:r>
     </w:p>
     <w:bookmarkEnd w:id="36"/>
-    <w:bookmarkStart w:id="37" w:name="X9595a9bb339e08d65399a059096afa9ae72a457"/>
+    <w:bookmarkStart w:id="37" w:name="technological-capability-moderation-h2"/>
     <w:p>
       <w:pPr>
         <w:pStyle w:val="Heading3"/>
@@ -2645,7 +2645,7 @@
       </w:r>
     </w:p>
     <w:bookmarkEnd w:id="37"/>
-    <w:bookmarkStart w:id="38" w:name="X151158cb9bb4ce58412a9381bb2aaa4f708d4d3"/>
+    <w:bookmarkStart w:id="38" w:name="digital-adoption-moderation-h3"/>
     <w:p>
       <w:pPr>
         <w:pStyle w:val="Heading3"/>
@@ -2807,7 +2807,7 @@
       </w:r>
     </w:p>
     <w:bookmarkEnd w:id="38"/>
-    <w:bookmarkStart w:id="39" w:name="X8c2848f12d916aaecc7d070f2d4e848d015e61e"/>
+    <w:bookmarkStart w:id="39" w:name="managerial-characteristics-h4-1"/>
     <w:p>
       <w:pPr>
         <w:pStyle w:val="Heading3"/>
@@ -2939,7 +2939,7 @@
       </w:r>
     </w:p>
     <w:bookmarkEnd w:id="39"/>
-    <w:bookmarkStart w:id="40" w:name="Xa3f0408b049fb96786efb222e5b901022bb2da2"/>
+    <w:bookmarkStart w:id="40" w:name="institutional-regime-moderation-h5"/>
     <w:p>
       <w:pPr>
         <w:pStyle w:val="Heading3"/>
@@ -3085,7 +3085,7 @@
         <w:t xml:space="preserve"> </w:t>
       </w:r>
       <w:r>
-        <w:t xml:space="preserve">turning point is approximately 28%; for Group V–VI (Frontier/SIDS), the</w:t>
+        <w:t xml:space="preserve">turning point is approximately 28%; for Group V–VI (Emerging/SIDS), the</w:t>
       </w:r>
       <w:r>
         <w:t xml:space="preserve"> </w:t>
@@ -3155,7 +3155,7 @@
       </w:r>
     </w:p>
     <w:bookmarkEnd w:id="40"/>
-    <w:bookmarkStart w:id="41" w:name="Xa51c5497f5122fc9a49f126906c933c8949a1b3"/>
+    <w:bookmarkStart w:id="41" w:name="full-three-way-moderation-h6"/>
     <w:p>
       <w:pPr>
         <w:pStyle w:val="Heading3"/>
@@ -3249,7 +3249,7 @@
         <w:pStyle w:val="BodyText"/>
       </w:pPr>
       <w:r>
-        <w:t xml:space="preserve">AdjR² = .067 in M11 (vs. .049 in M10) indicates meaningful incremental</w:t>
+        <w:t xml:space="preserve">AdjR² = .067 in M11 (vs. .049 in M10) indicates meaningful incremental</w:t>
       </w:r>
       <w:r>
         <w:t xml:space="preserve"> </w:t>
@@ -3305,7 +3305,7 @@
         <w:t xml:space="preserve"> </w:t>
       </w:r>
       <w:r>
-        <w:t xml:space="preserve">significance, the WBES DAI measure's limited dimensionality (Tier 1–2</w:t>
+        <w:t xml:space="preserve">significance, the WBES DAI measure’s limited dimensionality (Tier 1–2</w:t>
       </w:r>
       <w:r>
         <w:t xml:space="preserve"> </w:t>
@@ -3322,7 +3322,7 @@
     </w:p>
     <w:bookmarkEnd w:id="41"/>
     <w:bookmarkEnd w:id="42"/>
-    <w:bookmarkStart w:id="48" w:name="X735612638e4e736e4693e459c258977262c0dfc"/>
+    <w:bookmarkStart w:id="48" w:name="discussion"/>
     <w:p>
       <w:pPr>
         <w:pStyle w:val="Heading2"/>
@@ -3331,7 +3331,7 @@
         <w:t xml:space="preserve">5. Discussion</w:t>
       </w:r>
     </w:p>
-    <w:bookmarkStart w:id="43" w:name="Xdb3d0d0ea2b17533512dc509acb289540c6f5bb"/>
+    <w:bookmarkStart w:id="43" w:name="resolution-of-cross-study-heterogeneity"/>
     <w:p>
       <w:pPr>
         <w:pStyle w:val="Heading3"/>
@@ -3421,7 +3421,7 @@
       </w:r>
     </w:p>
     <w:bookmarkEnd w:id="43"/>
-    <w:bookmarkStart w:id="44" w:name="X3e958d55d5690299d9deebec25f8bb524b314c6"/>
+    <w:bookmarkStart w:id="44" w:name="technology-as-amplifier-not-moderator"/>
     <w:p>
       <w:pPr>
         <w:pStyle w:val="Heading3"/>
@@ -3511,7 +3511,7 @@
       </w:r>
     </w:p>
     <w:bookmarkEnd w:id="44"/>
-    <w:bookmarkStart w:id="45" w:name="X6dd7d6eceb2ff81026d810222fc30c1f86e05e5"/>
+    <w:bookmarkStart w:id="45" w:name="Xf6197b5ae9fc313cd14220a896ca012fd7330cf"/>
     <w:p>
       <w:pPr>
         <w:pStyle w:val="Heading3"/>
@@ -3543,7 +3543,7 @@
         <w:t xml:space="preserve"> </w:t>
       </w:r>
       <w:r>
-        <w:t xml:space="preserve">digital capabilities' performance effects are context-contingent. In</w:t>
+        <w:t xml:space="preserve">digital capabilities’ performance effects are context-contingent. In</w:t>
       </w:r>
       <w:r>
         <w:t xml:space="preserve"> </w:t>
@@ -3589,7 +3589,7 @@
       </w:r>
     </w:p>
     <w:bookmarkEnd w:id="45"/>
-    <w:bookmarkStart w:id="46" w:name="X84f38018b3434e120970b4f2e30dde187cbc62e"/>
+    <w:bookmarkStart w:id="46" w:name="managerial-heterogeneity"/>
     <w:p>
       <w:pPr>
         <w:pStyle w:val="Heading3"/>
@@ -3723,7 +3723,7 @@
         <w:t xml:space="preserve"> </w:t>
       </w:r>
       <w:r>
-        <w:t xml:space="preserve">reduces women's wage employment probability by 8.1 percentage points and</w:t>
+        <w:t xml:space="preserve">reduces women’s wage employment probability by 8.1 percentage points and</w:t>
       </w:r>
       <w:r>
         <w:t xml:space="preserve"> </w:t>
@@ -3787,7 +3787,7 @@
       </w:r>
     </w:p>
     <w:bookmarkEnd w:id="46"/>
-    <w:bookmarkStart w:id="47" w:name="Xde7edcb3f604b7ff7a62d585547252a5b42f172"/>
+    <w:bookmarkStart w:id="47" w:name="limitations"/>
     <w:p>
       <w:pPr>
         <w:pStyle w:val="Heading3"/>
@@ -3807,7 +3807,25 @@
         <w:t xml:space="preserve"> </w:t>
       </w:r>
       <w:r>
-        <w:t xml:space="preserve">cross-sectional design: the term "performance" throughout refers to a</w:t>
+        <w:t xml:space="preserve">cross-sectional design: the term</w:t>
+      </w:r>
+      <w:r>
+        <w:t xml:space="preserve"> </w:t>
+      </w:r>
+      <w:r>
+        <w:t xml:space="preserve">“</w:t>
+      </w:r>
+      <w:r>
+        <w:t xml:space="preserve">performance</w:t>
+      </w:r>
+      <w:r>
+        <w:t xml:space="preserve">”</w:t>
+      </w:r>
+      <w:r>
+        <w:t xml:space="preserve"> </w:t>
+      </w:r>
+      <w:r>
+        <w:t xml:space="preserve">throughout refers to a</w:t>
       </w:r>
       <w:r>
         <w:t xml:space="preserve"> </w:t>
@@ -3861,7 +3879,7 @@
         <w:t xml:space="preserve"> </w:t>
       </w:r>
       <w:r>
-        <w:t xml:space="preserve">groups; however, Oman's available wave (2003) predates the</w:t>
+        <w:t xml:space="preserve">groups; however, Oman’s available wave (2003) predates the</w:t>
       </w:r>
       <w:r>
         <w:t xml:space="preserve"> </w:t>
@@ -3884,7 +3902,7 @@
     </w:p>
     <w:bookmarkEnd w:id="47"/>
     <w:bookmarkEnd w:id="48"/>
-    <w:bookmarkStart w:id="49" w:name="X56025c6d9dbf7520f7a7df11f905cdd09f46e4a"/>
+    <w:bookmarkStart w:id="49" w:name="conclusions"/>
     <w:p>
       <w:pPr>
         <w:pStyle w:val="Heading2"/>
@@ -4124,11 +4142,11 @@
         <w:pStyle w:val="FirstParagraph"/>
       </w:pPr>
       <w:r>
-        <w:t xml:space="preserve">During the preparation of this work, the author(s) used Grammarly, a writing-assistance tool, to correct spelling, grammar, and punctuation in the author(s)' own original text. No generative artificial-intelligence tool was used to generate, draft, or create any substantive content, analysis, or interpretation. The author(s) reviewed and edited the output and take(s) full responsibility for the content of the publication.</w:t>
+        <w:t xml:space="preserve">During the preparation of this work, the author(s) used Grammarly, a writing-assistance tool, to correct spelling, grammar, and punctuation in the author(s)’ own original text. No generative artificial-intelligence tool was used to generate, draft, or create any substantive content, analysis, or interpretation. The author(s) reviewed and edited the output and take(s) full responsibility for the content of the publication.</w:t>
       </w:r>
     </w:p>
     <w:bookmarkEnd w:id="50"/>
-    <w:bookmarkStart w:id="78" w:name="references"/>
+    <w:bookmarkStart w:id="75" w:name="references"/>
     <w:p>
       <w:pPr>
         <w:pStyle w:val="Heading2"/>
@@ -4817,53 +4835,48 @@
       <w:r>
         <w:t xml:space="preserve"> </w:t>
       </w:r>
+      <w:r>
+        <w:t xml:space="preserve">https://doi.org/10.5772/intechopen.1011012</w:t>
+      </w:r>
+    </w:p>
+    <w:p>
+      <w:pPr>
+        <w:pStyle w:val="BodyText"/>
+      </w:pPr>
+      <w:r>
+        <w:t xml:space="preserve">Hambrick, D. C. (2007). Upper echelons theory: An update.</w:t>
+      </w:r>
+      <w:r>
+        <w:t xml:space="preserve"> </w:t>
+      </w:r>
+      <w:r>
+        <w:rPr>
+          <w:iCs/>
+          <w:i/>
+        </w:rPr>
+        <w:t xml:space="preserve">Academy of</w:t>
+      </w:r>
+      <w:r>
+        <w:rPr>
+          <w:iCs/>
+          <w:i/>
+        </w:rPr>
+        <w:t xml:space="preserve"> </w:t>
+      </w:r>
+      <w:r>
+        <w:rPr>
+          <w:iCs/>
+          <w:i/>
+        </w:rPr>
+        <w:t xml:space="preserve">Management Review, 32</w:t>
+      </w:r>
+      <w:r>
+        <w:t xml:space="preserve">(2), 334–343.</w:t>
+      </w:r>
+      <w:r>
+        <w:t xml:space="preserve"> </w:t>
+      </w:r>
       <w:hyperlink r:id="rId61">
-        <w:r>
-          <w:rPr>
-            <w:rStyle w:val="Hyperlink"/>
-          </w:rPr>
-          <w:t xml:space="preserve">https://doi.org/10.5772/intechopen.1011012</w:t>
-        </w:r>
-      </w:hyperlink>
-    </w:p>
-    <w:p>
-      <w:pPr>
-        <w:pStyle w:val="BodyText"/>
-      </w:pPr>
-      <w:r>
-        <w:t xml:space="preserve">Hambrick, D. C. (2007). Upper echelons theory: An update.</w:t>
-      </w:r>
-      <w:r>
-        <w:t xml:space="preserve"> </w:t>
-      </w:r>
-      <w:r>
-        <w:rPr>
-          <w:iCs/>
-          <w:i/>
-        </w:rPr>
-        <w:t xml:space="preserve">Academy of</w:t>
-      </w:r>
-      <w:r>
-        <w:rPr>
-          <w:iCs/>
-          <w:i/>
-        </w:rPr>
-        <w:t xml:space="preserve"> </w:t>
-      </w:r>
-      <w:r>
-        <w:rPr>
-          <w:iCs/>
-          <w:i/>
-        </w:rPr>
-        <w:t xml:space="preserve">Management Review, 32</w:t>
-      </w:r>
-      <w:r>
-        <w:t xml:space="preserve">(2), 334–343.</w:t>
-      </w:r>
-      <w:r>
-        <w:t xml:space="preserve"> </w:t>
-      </w:r>
-      <w:hyperlink r:id="rId62">
         <w:r>
           <w:rPr>
             <w:rStyle w:val="Hyperlink"/>
@@ -4915,7 +4928,7 @@
       <w:r>
         <w:t xml:space="preserve"> </w:t>
       </w:r>
-      <w:hyperlink r:id="rId63">
+      <w:hyperlink r:id="rId62">
         <w:r>
           <w:rPr>
             <w:rStyle w:val="Hyperlink"/>
@@ -4997,7 +5010,7 @@
           <w:iCs/>
           <w:i/>
         </w:rPr>
-        <w:t xml:space="preserve">Women in leadership in Viet Nam's banking sector</w:t>
+        <w:t xml:space="preserve">Women in leadership in Viet Nam’s banking sector</w:t>
       </w:r>
       <w:r>
         <w:t xml:space="preserve">. IFC, World Bank</w:t>
@@ -5050,7 +5063,7 @@
       <w:r>
         <w:t xml:space="preserve"> </w:t>
       </w:r>
-      <w:hyperlink r:id="rId64">
+      <w:hyperlink r:id="rId63">
         <w:r>
           <w:rPr>
             <w:rStyle w:val="Hyperlink"/>
@@ -5100,7 +5113,7 @@
       <w:r>
         <w:t xml:space="preserve"> </w:t>
       </w:r>
-      <w:hyperlink r:id="rId65">
+      <w:hyperlink r:id="rId64">
         <w:r>
           <w:rPr>
             <w:rStyle w:val="Hyperlink"/>
@@ -5144,7 +5157,7 @@
       <w:r>
         <w:t xml:space="preserve"> </w:t>
       </w:r>
-      <w:hyperlink r:id="rId66">
+      <w:hyperlink r:id="rId65">
         <w:r>
           <w:rPr>
             <w:rStyle w:val="Hyperlink"/>
@@ -5196,7 +5209,7 @@
       <w:r>
         <w:t xml:space="preserve"> </w:t>
       </w:r>
-      <w:hyperlink r:id="rId67">
+      <w:hyperlink r:id="rId66">
         <w:r>
           <w:rPr>
             <w:rStyle w:val="Hyperlink"/>
@@ -5248,7 +5261,7 @@
       <w:r>
         <w:t xml:space="preserve"> </w:t>
       </w:r>
-      <w:hyperlink r:id="rId68">
+      <w:hyperlink r:id="rId67">
         <w:r>
           <w:rPr>
             <w:rStyle w:val="Hyperlink"/>
@@ -5300,7 +5313,7 @@
       <w:r>
         <w:t xml:space="preserve"> </w:t>
       </w:r>
-      <w:hyperlink r:id="rId69">
+      <w:hyperlink r:id="rId68">
         <w:r>
           <w:rPr>
             <w:rStyle w:val="Hyperlink"/>
@@ -5350,7 +5363,7 @@
       <w:r>
         <w:t xml:space="preserve"> </w:t>
       </w:r>
-      <w:hyperlink r:id="rId70">
+      <w:hyperlink r:id="rId69">
         <w:r>
           <w:rPr>
             <w:rStyle w:val="Hyperlink"/>
@@ -5443,14 +5456,9 @@
       <w:r>
         <w:t xml:space="preserve"> </w:t>
       </w:r>
-      <w:hyperlink r:id="rId71">
-        <w:r>
-          <w:rPr>
-            <w:rStyle w:val="Hyperlink"/>
-          </w:rPr>
-          <w:t xml:space="preserve">https://doi.org/10.1007/s11575-010-0029-0</w:t>
-        </w:r>
-      </w:hyperlink>
+      <w:r>
+        <w:t xml:space="preserve">https://doi.org/10.1007/s11575-010-0029-0</w:t>
+      </w:r>
     </w:p>
     <w:p>
       <w:pPr>
@@ -5516,7 +5524,7 @@
       <w:r>
         <w:t xml:space="preserve"> </w:t>
       </w:r>
-      <w:hyperlink r:id="rId72">
+      <w:hyperlink r:id="rId70">
         <w:r>
           <w:rPr>
             <w:rStyle w:val="Hyperlink"/>
@@ -5536,7 +5544,7 @@
         <w:t xml:space="preserve"> </w:t>
       </w:r>
       <w:r>
-        <w:t xml:space="preserve">managers' experience and gender on internationalization and firm</w:t>
+        <w:t xml:space="preserve">managers’ experience and gender on internationalization and firm</w:t>
       </w:r>
       <w:r>
         <w:t xml:space="preserve"> </w:t>
@@ -5561,19 +5569,8 @@
         <w:t xml:space="preserve"> </w:t>
       </w:r>
       <w:r>
-        <w:t xml:space="preserve">1209–1216.</w:t>
-      </w:r>
-      <w:r>
-        <w:t xml:space="preserve"> </w:t>
-      </w:r>
-      <w:hyperlink r:id="rId73">
-        <w:r>
-          <w:rPr>
-            <w:rStyle w:val="Hyperlink"/>
-          </w:rPr>
-          <w:t xml:space="preserve">https://doi.org/10.5267/j.ac.2020.9.006</w:t>
-        </w:r>
-      </w:hyperlink>
+        <w:t xml:space="preserve">1209–1216. https://doi.org/10.5267/j.ac.2020.9.006</w:t>
+      </w:r>
     </w:p>
     <w:p>
       <w:pPr>
@@ -5744,7 +5741,7 @@
       <w:r>
         <w:t xml:space="preserve"> </w:t>
       </w:r>
-      <w:hyperlink r:id="rId74">
+      <w:hyperlink r:id="rId71">
         <w:r>
           <w:rPr>
             <w:rStyle w:val="Hyperlink"/>
@@ -5790,7 +5787,7 @@
       <w:r>
         <w:t xml:space="preserve"> </w:t>
       </w:r>
-      <w:hyperlink r:id="rId75">
+      <w:hyperlink r:id="rId72">
         <w:r>
           <w:rPr>
             <w:rStyle w:val="Hyperlink"/>
@@ -5822,7 +5819,7 @@
       <w:r>
         <w:t xml:space="preserve"> </w:t>
       </w:r>
-      <w:hyperlink r:id="rId76">
+      <w:hyperlink r:id="rId73">
         <w:r>
           <w:rPr>
             <w:rStyle w:val="Hyperlink"/>
@@ -5944,7 +5941,7 @@
       <w:r>
         <w:t xml:space="preserve"> </w:t>
       </w:r>
-      <w:hyperlink r:id="rId77">
+      <w:hyperlink r:id="rId74">
         <w:r>
           <w:rPr>
             <w:rStyle w:val="Hyperlink"/>
@@ -6041,7 +6038,7 @@
       <w:r>
         <w:t xml:space="preserve"> </w:t>
       </w:r>
-      <w:hyperlink r:id="rId77">
+      <w:hyperlink r:id="rId74">
         <w:r>
           <w:rPr>
             <w:rStyle w:val="Hyperlink"/>
@@ -6083,8 +6080,8 @@
         <w:t xml:space="preserve">(4), 305–320.</w:t>
       </w:r>
     </w:p>
-    <w:bookmarkEnd w:id="78"/>
-    <w:bookmarkStart w:id="79" w:name="appendix-a-model-sequence"/>
+    <w:bookmarkEnd w:id="75"/>
+    <w:bookmarkStart w:id="76" w:name="appendix-a-model-sequence"/>
     <w:p>
       <w:pPr>
         <w:pStyle w:val="Heading2"/>
@@ -6108,15 +6105,15 @@
     <w:tbl>
       <w:tblPr>
         <w:tblStyle w:val="Table"/>
-        <w:tblW w:type="auto" w:w="0"/>
+        <w:tblW w:type="pct" w:w="5000"/>
         <w:tblLook w:firstRow="1" w:lastRow="0" w:firstColumn="0" w:lastColumn="0" w:noHBand="0" w:noVBand="0" w:val="0020"/>
         <w:jc w:val="start"/>
       </w:tblPr>
       <w:tblGrid>
-        <w:gridCol w:w="1980"/>
-        <w:gridCol w:w="1980"/>
-        <w:gridCol w:w="1980"/>
-        <w:gridCol w:w="1980"/>
+        <w:gridCol w:w="1307"/>
+        <w:gridCol w:w="4229"/>
+        <w:gridCol w:w="1614"/>
+        <w:gridCol w:w="768"/>
       </w:tblGrid>
       <w:tr>
         <w:trPr>
@@ -6737,17 +6734,17 @@
     <w:tbl>
       <w:tblPr>
         <w:tblStyle w:val="Table"/>
-        <w:tblW w:type="auto" w:w="0"/>
+        <w:tblW w:type="pct" w:w="5000"/>
         <w:tblLook w:firstRow="1" w:lastRow="0" w:firstColumn="0" w:lastColumn="0" w:noHBand="0" w:noVBand="0" w:val="0020"/>
         <w:jc w:val="start"/>
       </w:tblPr>
       <w:tblGrid>
-        <w:gridCol w:w="1320"/>
-        <w:gridCol w:w="1320"/>
-        <w:gridCol w:w="1320"/>
-        <w:gridCol w:w="1320"/>
-        <w:gridCol w:w="1320"/>
-        <w:gridCol w:w="1320"/>
+        <w:gridCol w:w="652"/>
+        <w:gridCol w:w="745"/>
+        <w:gridCol w:w="745"/>
+        <w:gridCol w:w="1770"/>
+        <w:gridCol w:w="745"/>
+        <w:gridCol w:w="3261"/>
       </w:tblGrid>
       <w:tr>
         <w:trPr>
@@ -7720,17 +7717,17 @@
     <w:tbl>
       <w:tblPr>
         <w:tblStyle w:val="Table"/>
-        <w:tblW w:type="auto" w:w="0"/>
+        <w:tblW w:type="pct" w:w="5000"/>
         <w:tblLook w:firstRow="1" w:lastRow="0" w:firstColumn="0" w:lastColumn="0" w:noHBand="0" w:noVBand="0" w:val="0020"/>
         <w:jc w:val="start"/>
       </w:tblPr>
       <w:tblGrid>
-        <w:gridCol w:w="1320"/>
-        <w:gridCol w:w="1320"/>
-        <w:gridCol w:w="1320"/>
-        <w:gridCol w:w="1320"/>
-        <w:gridCol w:w="1320"/>
-        <w:gridCol w:w="1320"/>
+        <w:gridCol w:w="1473"/>
+        <w:gridCol w:w="1289"/>
+        <w:gridCol w:w="1289"/>
+        <w:gridCol w:w="1289"/>
+        <w:gridCol w:w="1289"/>
+        <w:gridCol w:w="1289"/>
       </w:tblGrid>
       <w:tr>
         <w:trPr>
@@ -8968,8 +8965,8 @@
         <w:t xml:space="preserve">mgr_female=+0.187***, female_owner=+0.128**.</w:t>
       </w:r>
     </w:p>
-    <w:bookmarkEnd w:id="79"/>
-    <w:bookmarkStart w:id="80" w:name="X09b5d89c7c8f35bf9d25d1bfe47da72b2ba58bf"/>
+    <w:bookmarkEnd w:id="76"/>
+    <w:bookmarkStart w:id="77" w:name="X09b5d89c7c8f35bf9d25d1bfe47da72b2ba58bf"/>
     <w:p>
       <w:pPr>
         <w:pStyle w:val="Heading2"/>
@@ -9049,11 +9046,11 @@
         <w:t xml:space="preserve"> </w:t>
       </w:r>
       <w:r>
-        <w:t xml:space="preserve">to output-per-worker vs. total-factor productivity operationalisations.</w:t>
-      </w:r>
-    </w:p>
-    <w:bookmarkEnd w:id="80"/>
-    <w:bookmarkEnd w:id="81"/>
+        <w:t xml:space="preserve">to output-per-worker vs. total-factor productivity operationalisations.</w:t>
+      </w:r>
+    </w:p>
+    <w:bookmarkEnd w:id="77"/>
+    <w:bookmarkEnd w:id="78"/>
     <w:sectPr/>
   </w:body>
 </w:document>

</xml_diff>